<commit_message>
Update BA Seminar Akhir Skripsi
</commit_message>
<xml_diff>
--- a/skripsi/2_Form BA Ujian Skripsi.docx
+++ b/skripsi/2_Form BA Ujian Skripsi.docx
@@ -3134,15 +3134,6 @@
     </w:p>
     <w:p>
       <w:pPr>
-        <w:spacing w:line="360" w:lineRule="auto"/>
-        <w:rPr>
-          <w:b/>
-          <w:lang w:val="id-ID"/>
-        </w:rPr>
-      </w:pPr>
-    </w:p>
-    <w:p>
-      <w:pPr>
         <w:numPr>
           <w:ilvl w:val="0"/>
           <w:numId w:val="1"/>
@@ -3181,33 +3172,53 @@
         <w:t>:</w:t>
       </w:r>
     </w:p>
-    <w:p>
-      <w:pPr>
-        <w:spacing w:line="360" w:lineRule="auto"/>
-        <w:ind w:left="357"/>
-        <w:rPr>
-          <w:lang w:val="en-US"/>
-        </w:rPr>
-      </w:pPr>
-      <w:r>
-        <w:rPr>
-          <w:lang w:val="en-US"/>
-        </w:rPr>
-        <w:t>{</w:t>
-      </w:r>
-      <w:r>
-        <w:rPr>
-          <w:lang w:val="en-US"/>
-        </w:rPr>
-        <w:t>Judul</w:t>
-      </w:r>
-      <w:r>
-        <w:rPr>
-          <w:lang w:val="en-US"/>
-        </w:rPr>
-        <w:t>SkripsiRevisi}</w:t>
-      </w:r>
-    </w:p>
+    <w:tbl>
+      <w:tblPr>
+        <w:tblStyle w:val="TableGrid"/>
+        <w:tblW w:w="0" w:type="auto"/>
+        <w:tblInd w:w="357" w:type="dxa"/>
+        <w:tblLook w:val="04A0" w:firstRow="1" w:lastRow="0" w:firstColumn="1" w:lastColumn="0" w:noHBand="0" w:noVBand="1"/>
+      </w:tblPr>
+      <w:tblGrid>
+        <w:gridCol w:w="9533"/>
+      </w:tblGrid>
+      <w:tr>
+        <w:trPr>
+          <w:trHeight w:val="909"/>
+        </w:trPr>
+        <w:tc>
+          <w:tcPr>
+            <w:tcW w:w="9890" w:type="dxa"/>
+          </w:tcPr>
+          <w:p>
+            <w:pPr>
+              <w:spacing w:line="360" w:lineRule="auto"/>
+              <w:rPr>
+                <w:lang w:val="en-US"/>
+              </w:rPr>
+            </w:pPr>
+            <w:r>
+              <w:rPr>
+                <w:lang w:val="en-US"/>
+              </w:rPr>
+              <w:t>{</w:t>
+            </w:r>
+            <w:r>
+              <w:rPr>
+                <w:lang w:val="en-US"/>
+              </w:rPr>
+              <w:t>Judul</w:t>
+            </w:r>
+            <w:r>
+              <w:rPr>
+                <w:lang w:val="en-US"/>
+              </w:rPr>
+              <w:t>SkripsiRevisi}</w:t>
+            </w:r>
+          </w:p>
+        </w:tc>
+      </w:tr>
+    </w:tbl>
     <w:p>
       <w:pPr>
         <w:spacing w:line="360" w:lineRule="auto"/>
@@ -3251,27 +3262,47 @@
         <w:t>:</w:t>
       </w:r>
     </w:p>
-    <w:p>
-      <w:pPr>
-        <w:spacing w:line="360" w:lineRule="auto"/>
-        <w:ind w:left="357"/>
-        <w:rPr>
-          <w:lang w:val="en-US"/>
-        </w:rPr>
-      </w:pPr>
-      <w:r>
-        <w:rPr>
-          <w:lang w:val="id-ID"/>
-        </w:rPr>
-        <w:t>{</w:t>
-      </w:r>
-      <w:r>
-        <w:rPr>
-          <w:lang w:val="en-US"/>
-        </w:rPr>
-        <w:t>Metode}</w:t>
-      </w:r>
-    </w:p>
+    <w:tbl>
+      <w:tblPr>
+        <w:tblStyle w:val="TableGrid"/>
+        <w:tblW w:w="0" w:type="auto"/>
+        <w:tblInd w:w="357" w:type="dxa"/>
+        <w:tblLook w:val="04A0" w:firstRow="1" w:lastRow="0" w:firstColumn="1" w:lastColumn="0" w:noHBand="0" w:noVBand="1"/>
+      </w:tblPr>
+      <w:tblGrid>
+        <w:gridCol w:w="9533"/>
+      </w:tblGrid>
+      <w:tr>
+        <w:trPr>
+          <w:trHeight w:val="1274"/>
+        </w:trPr>
+        <w:tc>
+          <w:tcPr>
+            <w:tcW w:w="9890" w:type="dxa"/>
+          </w:tcPr>
+          <w:p>
+            <w:pPr>
+              <w:spacing w:line="360" w:lineRule="auto"/>
+              <w:rPr>
+                <w:lang w:val="en-US"/>
+              </w:rPr>
+            </w:pPr>
+            <w:r>
+              <w:rPr>
+                <w:lang w:val="id-ID"/>
+              </w:rPr>
+              <w:t>{</w:t>
+            </w:r>
+            <w:r>
+              <w:rPr>
+                <w:lang w:val="en-US"/>
+              </w:rPr>
+              <w:t>Metode}</w:t>
+            </w:r>
+          </w:p>
+        </w:tc>
+      </w:tr>
+    </w:tbl>
     <w:p>
       <w:pPr>
         <w:spacing w:line="360" w:lineRule="auto"/>
@@ -3322,21 +3353,41 @@
         <w:t xml:space="preserve"> </w:t>
       </w:r>
     </w:p>
-    <w:p>
-      <w:pPr>
-        <w:spacing w:line="360" w:lineRule="auto"/>
-        <w:ind w:left="357"/>
-        <w:rPr>
-          <w:lang w:val="en-US"/>
-        </w:rPr>
-      </w:pPr>
-      <w:r>
-        <w:rPr>
-          <w:lang w:val="en-US"/>
-        </w:rPr>
-        <w:t>{Penulisan}</w:t>
-      </w:r>
-    </w:p>
+    <w:tbl>
+      <w:tblPr>
+        <w:tblStyle w:val="TableGrid"/>
+        <w:tblW w:w="0" w:type="auto"/>
+        <w:tblInd w:w="357" w:type="dxa"/>
+        <w:tblLook w:val="04A0" w:firstRow="1" w:lastRow="0" w:firstColumn="1" w:lastColumn="0" w:noHBand="0" w:noVBand="1"/>
+      </w:tblPr>
+      <w:tblGrid>
+        <w:gridCol w:w="9533"/>
+      </w:tblGrid>
+      <w:tr>
+        <w:trPr>
+          <w:trHeight w:val="1135"/>
+        </w:trPr>
+        <w:tc>
+          <w:tcPr>
+            <w:tcW w:w="9890" w:type="dxa"/>
+          </w:tcPr>
+          <w:p>
+            <w:pPr>
+              <w:spacing w:line="360" w:lineRule="auto"/>
+              <w:rPr>
+                <w:lang w:val="en-US"/>
+              </w:rPr>
+            </w:pPr>
+            <w:r>
+              <w:rPr>
+                <w:lang w:val="en-US"/>
+              </w:rPr>
+              <w:t>{Penulisan}</w:t>
+            </w:r>
+          </w:p>
+        </w:tc>
+      </w:tr>
+    </w:tbl>
     <w:p>
       <w:pPr>
         <w:spacing w:line="360" w:lineRule="auto"/>
@@ -3379,21 +3430,41 @@
         <w:t>:</w:t>
       </w:r>
     </w:p>
-    <w:p>
-      <w:pPr>
-        <w:spacing w:line="360" w:lineRule="auto"/>
-        <w:ind w:left="357"/>
-        <w:rPr>
-          <w:lang w:val="id-ID"/>
-        </w:rPr>
-      </w:pPr>
-      <w:r>
-        <w:rPr>
-          <w:lang w:val="id-ID"/>
-        </w:rPr>
-        <w:t>{Saran}</w:t>
-      </w:r>
-    </w:p>
+    <w:tbl>
+      <w:tblPr>
+        <w:tblStyle w:val="TableGrid"/>
+        <w:tblW w:w="0" w:type="auto"/>
+        <w:tblInd w:w="357" w:type="dxa"/>
+        <w:tblLook w:val="04A0" w:firstRow="1" w:lastRow="0" w:firstColumn="1" w:lastColumn="0" w:noHBand="0" w:noVBand="1"/>
+      </w:tblPr>
+      <w:tblGrid>
+        <w:gridCol w:w="9533"/>
+      </w:tblGrid>
+      <w:tr>
+        <w:trPr>
+          <w:trHeight w:val="1683"/>
+        </w:trPr>
+        <w:tc>
+          <w:tcPr>
+            <w:tcW w:w="9890" w:type="dxa"/>
+          </w:tcPr>
+          <w:p>
+            <w:pPr>
+              <w:spacing w:line="360" w:lineRule="auto"/>
+              <w:rPr>
+                <w:lang w:val="id-ID"/>
+              </w:rPr>
+            </w:pPr>
+            <w:r>
+              <w:rPr>
+                <w:lang w:val="id-ID"/>
+              </w:rPr>
+              <w:t>{Saran}</w:t>
+            </w:r>
+          </w:p>
+        </w:tc>
+      </w:tr>
+    </w:tbl>
     <w:p>
       <w:pPr>
         <w:spacing w:line="360" w:lineRule="auto"/>

</xml_diff>